<commit_message>
Adding toolbox and monitoring objectives
</commit_message>
<xml_diff>
--- a/Terrestrial Benchmark Tool v4 User Manual.docx
+++ b/Terrestrial Benchmark Tool v4 User Manual.docx
@@ -10,8 +10,6 @@
           <w:rFonts w:ascii="Cambria" w:hAnsi="Cambria"/>
         </w:rPr>
       </w:pPr>
-      <w:bookmarkStart w:id="0" w:name="_Hlk105412975"/>
-      <w:bookmarkEnd w:id="0"/>
       <w:r>
         <w:rPr>
           <w:rFonts w:ascii="Cambria" w:hAnsi="Cambria"/>
@@ -20,15 +18,15 @@
           <w:sz w:val="20"/>
         </w:rPr>
         <w:drawing>
-          <wp:anchor distT="0" distB="0" distL="114300" distR="114300" simplePos="0" relativeHeight="251658240" behindDoc="0" locked="0" layoutInCell="1" allowOverlap="1" wp14:anchorId="769C8E51" wp14:editId="755C701C">
+          <wp:anchor distT="0" distB="0" distL="114300" distR="114300" simplePos="0" relativeHeight="251658240" behindDoc="0" locked="0" layoutInCell="1" allowOverlap="1" wp14:anchorId="769C8E51" wp14:editId="245912A1">
             <wp:simplePos x="0" y="0"/>
             <wp:positionH relativeFrom="column">
-              <wp:posOffset>-228600</wp:posOffset>
+              <wp:posOffset>457200</wp:posOffset>
             </wp:positionH>
             <wp:positionV relativeFrom="paragraph">
-              <wp:posOffset>419100</wp:posOffset>
+              <wp:posOffset>308610</wp:posOffset>
             </wp:positionV>
-            <wp:extent cx="1126320" cy="1110996"/>
+            <wp:extent cx="1125855" cy="1110615"/>
             <wp:effectExtent l="0" t="0" r="0" b="0"/>
             <wp:wrapSquare wrapText="bothSides"/>
             <wp:docPr id="1" name="image1.png" descr="A picture containing calendar&#10;&#10;Description automatically generated"/>
@@ -57,7 +55,7 @@
                   <pic:spPr>
                     <a:xfrm>
                       <a:off x="0" y="0"/>
-                      <a:ext cx="1126320" cy="1110996"/>
+                      <a:ext cx="1125855" cy="1110615"/>
                     </a:xfrm>
                     <a:prstGeom prst="rect">
                       <a:avLst/>
@@ -75,15 +73,6 @@
           </wp:anchor>
         </w:drawing>
       </w:r>
-    </w:p>
-    <w:p>
-      <w:pPr>
-        <w:pStyle w:val="Title"/>
-        <w:jc w:val="center"/>
-        <w:rPr>
-          <w:rFonts w:ascii="Cambria" w:hAnsi="Cambria"/>
-        </w:rPr>
-      </w:pPr>
       <w:r>
         <w:rPr>
           <w:rFonts w:ascii="Cambria" w:hAnsi="Cambria"/>
@@ -91,13 +80,13 @@
           <w:sz w:val="20"/>
         </w:rPr>
         <w:drawing>
-          <wp:anchor distT="0" distB="0" distL="114300" distR="114300" simplePos="0" relativeHeight="251659264" behindDoc="0" locked="0" layoutInCell="1" allowOverlap="1" wp14:anchorId="746FD588" wp14:editId="602AC40B">
+          <wp:anchor distT="0" distB="0" distL="114300" distR="114300" simplePos="0" relativeHeight="251659264" behindDoc="0" locked="0" layoutInCell="1" allowOverlap="1" wp14:anchorId="746FD588" wp14:editId="60DEE69F">
             <wp:simplePos x="0" y="0"/>
             <wp:positionH relativeFrom="column">
-              <wp:posOffset>3969404</wp:posOffset>
+              <wp:posOffset>4321810</wp:posOffset>
             </wp:positionH>
             <wp:positionV relativeFrom="paragraph">
-              <wp:posOffset>41910</wp:posOffset>
+              <wp:posOffset>306705</wp:posOffset>
             </wp:positionV>
             <wp:extent cx="1272235" cy="1114805"/>
             <wp:effectExtent l="0" t="0" r="4445" b="9525"/>
@@ -155,6 +144,17 @@
           <w:rFonts w:ascii="Cambria" w:hAnsi="Cambria"/>
         </w:rPr>
       </w:pPr>
+      <w:bookmarkStart w:id="0" w:name="_Hlk105412975"/>
+      <w:bookmarkEnd w:id="0"/>
+    </w:p>
+    <w:p>
+      <w:pPr>
+        <w:pStyle w:val="Title"/>
+        <w:jc w:val="center"/>
+        <w:rPr>
+          <w:rFonts w:ascii="Cambria" w:hAnsi="Cambria"/>
+        </w:rPr>
+      </w:pPr>
     </w:p>
     <w:p>
       <w:pPr>
@@ -8724,13 +8724,7 @@
         <w:rPr>
           <w:rFonts w:ascii="Cambria" w:hAnsi="Cambria"/>
         </w:rPr>
-        <w:t>Specify whether this is a benchmark group or a reporting unit</w:t>
-      </w:r>
-      <w:r>
-        <w:rPr>
-          <w:rFonts w:ascii="Cambria" w:hAnsi="Cambria"/>
-        </w:rPr>
-        <w:t xml:space="preserve"> you want to update</w:t>
+        <w:t>Specify whether this is a benchmark group or a reporting unit you want to update</w:t>
       </w:r>
     </w:p>
     <w:p>
@@ -11709,6 +11703,26 @@
               </w:rPr>
               <w:t xml:space="preserve"> Cannot start with a number.</w:t>
             </w:r>
+            <w:r>
+              <w:rPr>
+                <w:rFonts w:ascii="Cambria" w:hAnsi="Cambria"/>
+              </w:rPr>
+              <w:t xml:space="preserve"> Cannot be the same as any field already present in </w:t>
+            </w:r>
+            <w:proofErr w:type="spellStart"/>
+            <w:r>
+              <w:rPr>
+                <w:rFonts w:ascii="Cambria" w:hAnsi="Cambria"/>
+              </w:rPr>
+              <w:t>Terradat</w:t>
+            </w:r>
+            <w:proofErr w:type="spellEnd"/>
+            <w:r>
+              <w:rPr>
+                <w:rFonts w:ascii="Cambria" w:hAnsi="Cambria"/>
+              </w:rPr>
+              <w:t>.</w:t>
+            </w:r>
           </w:p>
           <w:p>
             <w:pPr>
@@ -11770,6 +11784,12 @@
               </w:rPr>
               <w:t xml:space="preserve"> overarching management goal or question which the monitoring objective relates to. This will often be a Land Health Standard.</w:t>
             </w:r>
+            <w:r>
+              <w:rPr>
+                <w:rFonts w:ascii="Cambria" w:hAnsi="Cambria"/>
+              </w:rPr>
+              <w:t xml:space="preserve"> This will be used as an alias for the objective name.</w:t>
+            </w:r>
           </w:p>
         </w:tc>
         <w:tc>
@@ -12141,6 +12161,7 @@
               <w:rPr>
                 <w:rFonts w:ascii="Cambria" w:hAnsi="Cambria"/>
               </w:rPr>
+              <w:lastRenderedPageBreak/>
               <w:t>LL Relation</w:t>
             </w:r>
           </w:p>
@@ -12159,14 +12180,7 @@
               <w:rPr>
                 <w:rFonts w:ascii="Cambria" w:hAnsi="Cambria"/>
               </w:rPr>
-              <w:t xml:space="preserve">The lower limit relation. Either greater than (&gt;), </w:t>
-            </w:r>
-            <w:r>
-              <w:rPr>
-                <w:rFonts w:ascii="Cambria" w:hAnsi="Cambria"/>
-              </w:rPr>
-              <w:lastRenderedPageBreak/>
-              <w:t>greater than or equal to (&gt;=), or equal to (=).</w:t>
+              <w:t>The lower limit relation. Either greater than (&gt;), greater than or equal to (&gt;=), or equal to (=).</w:t>
             </w:r>
           </w:p>
         </w:tc>
@@ -12184,7 +12198,6 @@
               <w:rPr>
                 <w:rFonts w:ascii="Cambria" w:hAnsi="Cambria"/>
               </w:rPr>
-              <w:lastRenderedPageBreak/>
               <w:t>Dropdown List</w:t>
             </w:r>
             <w:r>

</xml_diff>